<commit_message>
updated the proposal as per recommendations
</commit_message>
<xml_diff>
--- a/Major Project Proposal Report on Self Healing System.docx
+++ b/Major Project Proposal Report on Self Healing System.docx
@@ -6964,13 +6964,13 @@
         <w:pStyle w:val="FormatTittle"/>
         <w:jc w:val="center"/>
       </w:pPr>
-      <w:bookmarkStart w:id="3" w:name="_Hlk221890340"/>
-      <w:bookmarkStart w:id="4" w:name="_Toc236342442"/>
+      <w:bookmarkStart w:id="3" w:name="_Toc236342442"/>
+      <w:bookmarkStart w:id="4" w:name="_Hlk221890340"/>
       <w:r>
         <w:lastRenderedPageBreak/>
         <w:t>LIST OF TABLES</w:t>
       </w:r>
-      <w:bookmarkEnd w:id="4"/>
+      <w:bookmarkEnd w:id="3"/>
     </w:p>
     <w:p>
       <w:pPr>
@@ -7580,7 +7580,7 @@
       <w:r>
         <w:fldChar w:fldCharType="end"/>
       </w:r>
-      <w:bookmarkEnd w:id="3"/>
+      <w:bookmarkEnd w:id="4"/>
     </w:p>
     <w:p>
       <w:pPr>
@@ -8106,9 +8106,17 @@
     <w:p>
       <w:pPr>
         <w:pStyle w:val="Heading2"/>
+        <w:rPr>
+          <w:b w:val="0"/>
+          <w:bCs/>
+        </w:rPr>
       </w:pPr>
       <w:bookmarkStart w:id="19" w:name="_Toc236342457"/>
       <w:r>
+        <w:rPr>
+          <w:b w:val="0"/>
+          <w:bCs/>
+        </w:rPr>
         <w:t>Rule-Based System Monitoring</w:t>
       </w:r>
       <w:bookmarkEnd w:id="19"/>
@@ -8127,9 +8135,17 @@
     <w:p>
       <w:pPr>
         <w:pStyle w:val="Heading2"/>
+        <w:rPr>
+          <w:b w:val="0"/>
+          <w:bCs/>
+        </w:rPr>
       </w:pPr>
       <w:bookmarkStart w:id="20" w:name="_Toc236342458"/>
       <w:r>
+        <w:rPr>
+          <w:b w:val="0"/>
+          <w:bCs/>
+        </w:rPr>
         <w:t>Autonomic Computing and Self-Healing Systems</w:t>
       </w:r>
       <w:bookmarkEnd w:id="20"/>
@@ -8157,9 +8173,17 @@
     <w:p>
       <w:pPr>
         <w:pStyle w:val="Heading2"/>
+        <w:rPr>
+          <w:b w:val="0"/>
+          <w:bCs/>
+        </w:rPr>
       </w:pPr>
       <w:bookmarkStart w:id="21" w:name="_Toc236342459"/>
       <w:r>
+        <w:rPr>
+          <w:b w:val="0"/>
+          <w:bCs/>
+        </w:rPr>
         <w:lastRenderedPageBreak/>
         <w:t>Self-Healing Web Applications</w:t>
       </w:r>
@@ -8179,9 +8203,17 @@
     <w:p>
       <w:pPr>
         <w:pStyle w:val="Heading2"/>
+        <w:rPr>
+          <w:b w:val="0"/>
+          <w:bCs/>
+        </w:rPr>
       </w:pPr>
       <w:bookmarkStart w:id="22" w:name="_Toc236342460"/>
       <w:r>
+        <w:rPr>
+          <w:b w:val="0"/>
+          <w:bCs/>
+        </w:rPr>
         <w:t>Failure Detection Using Predefined Rules</w:t>
       </w:r>
       <w:bookmarkEnd w:id="22"/>
@@ -8200,9 +8232,17 @@
     <w:p>
       <w:pPr>
         <w:pStyle w:val="Heading2"/>
+        <w:rPr>
+          <w:b w:val="0"/>
+          <w:bCs/>
+        </w:rPr>
       </w:pPr>
       <w:bookmarkStart w:id="23" w:name="_Toc236342461"/>
       <w:r>
+        <w:rPr>
+          <w:b w:val="0"/>
+          <w:bCs/>
+        </w:rPr>
         <w:t>Automated Recovery and Corrective Actions</w:t>
       </w:r>
       <w:bookmarkEnd w:id="23"/>
@@ -8237,9 +8277,17 @@
     <w:p>
       <w:pPr>
         <w:pStyle w:val="Heading2"/>
+        <w:rPr>
+          <w:b w:val="0"/>
+          <w:bCs/>
+        </w:rPr>
       </w:pPr>
       <w:bookmarkStart w:id="24" w:name="_Toc236342462"/>
       <w:r>
+        <w:rPr>
+          <w:b w:val="0"/>
+          <w:bCs/>
+        </w:rPr>
         <w:t>Event Logging and Administrator Notification</w:t>
       </w:r>
       <w:bookmarkEnd w:id="24"/>
@@ -8260,111 +8308,11 @@
       <w:pPr>
         <w:pStyle w:val="Heading2"/>
       </w:pPr>
-      <w:bookmarkStart w:id="25" w:name="_Toc236342463"/>
-      <w:r>
-        <w:t>Limitations of Existing Work</w:t>
+      <w:bookmarkStart w:id="25" w:name="_Toc236342464"/>
+      <w:r>
+        <w:t>Research Gap and Project Relevance</w:t>
       </w:r>
       <w:bookmarkEnd w:id="25"/>
-    </w:p>
-    <w:p>
-      <w:r>
-        <w:t>From the reviewed literature, several limitations are identified:</w:t>
-      </w:r>
-    </w:p>
-    <w:p>
-      <w:pPr>
-        <w:pStyle w:val="ListParagraph"/>
-        <w:numPr>
-          <w:ilvl w:val="0"/>
-          <w:numId w:val="2"/>
-        </w:numPr>
-      </w:pPr>
-      <w:r>
-        <w:t xml:space="preserve">Many systems detect failures but do not automatically recover, relying instead on manual intervention by administrators after alerts are generated. </w:t>
-      </w:r>
-    </w:p>
-    <w:p>
-      <w:pPr>
-        <w:pStyle w:val="ListParagraph"/>
-        <w:numPr>
-          <w:ilvl w:val="0"/>
-          <w:numId w:val="2"/>
-        </w:numPr>
-      </w:pPr>
-      <w:r>
-        <w:t xml:space="preserve">Some autonomic frameworks are complex and resource-intensive, making them unsuitable for lightweight or small-scale web applications. </w:t>
-      </w:r>
-    </w:p>
-    <w:p>
-      <w:pPr>
-        <w:pStyle w:val="ListParagraph"/>
-        <w:numPr>
-          <w:ilvl w:val="0"/>
-          <w:numId w:val="2"/>
-        </w:numPr>
-      </w:pPr>
-      <w:r>
-        <w:t xml:space="preserve">Several approaches assume large-scale or cloud-based infrastructure, which limits their applicability to standalone or traditional web application environments. </w:t>
-      </w:r>
-    </w:p>
-    <w:p>
-      <w:pPr>
-        <w:pStyle w:val="ListParagraph"/>
-        <w:numPr>
-          <w:ilvl w:val="0"/>
-          <w:numId w:val="2"/>
-        </w:numPr>
-      </w:pPr>
-      <w:r>
-        <w:t>There is limited focus on lightweight, rule-based self-healing layers that can be easily integrated with existing web applications without significant architectural changes.</w:t>
-      </w:r>
-    </w:p>
-    <w:p>
-      <w:pPr>
-        <w:pStyle w:val="ListParagraph"/>
-        <w:numPr>
-          <w:ilvl w:val="0"/>
-          <w:numId w:val="2"/>
-        </w:numPr>
-      </w:pPr>
-      <w:r>
-        <w:t>A number of solutions tightly couple recovery mechanisms with application architecture, reducing flexibility and increasing implementation complexity.</w:t>
-      </w:r>
-    </w:p>
-    <w:p>
-      <w:pPr>
-        <w:pStyle w:val="ListParagraph"/>
-        <w:numPr>
-          <w:ilvl w:val="0"/>
-          <w:numId w:val="2"/>
-        </w:numPr>
-      </w:pPr>
-      <w:r>
-        <w:t>Many existing systems prioritize infrastructure-level management while offering limited support for application-level failure detection and recovery.</w:t>
-      </w:r>
-    </w:p>
-    <w:p>
-      <w:pPr>
-        <w:pStyle w:val="ListParagraph"/>
-        <w:numPr>
-          <w:ilvl w:val="0"/>
-          <w:numId w:val="2"/>
-        </w:numPr>
-      </w:pPr>
-      <w:r>
-        <w:t>Some approaches emphasize learning-based or adaptive techniques, which may introduce unpredictability and increase system complexity, making validation and testing more difficult.</w:t>
-      </w:r>
-    </w:p>
-    <w:p/>
-    <w:p>
-      <w:pPr>
-        <w:pStyle w:val="Heading2"/>
-      </w:pPr>
-      <w:bookmarkStart w:id="26" w:name="_Toc236342464"/>
-      <w:r>
-        <w:t>Research Gap and Project Relevance</w:t>
-      </w:r>
-      <w:bookmarkEnd w:id="26"/>
     </w:p>
     <w:p>
       <w:pPr>
@@ -8399,16 +8347,7 @@
           <w:color w:val="auto"/>
           <w:szCs w:val="24"/>
         </w:rPr>
-        <w:t xml:space="preserve">A clear research gap exists in the development of simple and lightweight self-healing systems that can be applied directly to individual web applications without requiring </w:t>
-      </w:r>
-      <w:r>
-        <w:rPr>
-          <w:rFonts w:eastAsia="Times New Roman" w:cs="Times New Roman"/>
-          <w:color w:val="auto"/>
-          <w:szCs w:val="24"/>
-        </w:rPr>
-        <w:lastRenderedPageBreak/>
-        <w:t>extensive infrastructure support or architectural modifications. Many existing approaches emphasize advanced orchestration, learning-based techniques, or tightly coupled recovery mechanisms, which increase system complexity and limit their practical use in academic or small-scale settings.</w:t>
+        <w:t>A clear research gap exists in the development of simple and lightweight self-healing systems that can be applied directly to individual web applications without requiring extensive infrastructure support or architectural modifications. Many existing approaches emphasize advanced orchestration, learning-based techniques, or tightly coupled recovery mechanisms, which increase system complexity and limit their practical use in academic or small-scale settings.</w:t>
       </w:r>
     </w:p>
     <w:p>
@@ -8483,6 +8422,7 @@
     </w:p>
     <w:p>
       <w:r>
+        <w:lastRenderedPageBreak/>
         <w:t>U</w:t>
       </w:r>
       <w:r>
@@ -8504,43 +8444,49 @@
         <w:pStyle w:val="Heading1"/>
         <w:jc w:val="center"/>
       </w:pPr>
-      <w:bookmarkStart w:id="27" w:name="_Toc236342465"/>
+      <w:bookmarkStart w:id="26" w:name="_Toc236342465"/>
       <w:r>
         <w:lastRenderedPageBreak/>
         <w:t>METHODOLOGY</w:t>
       </w:r>
+      <w:bookmarkEnd w:id="26"/>
+    </w:p>
+    <w:p>
+      <w:r>
+        <w:t>This chapter describes the systematic approach followed to develop the Rule-Based Self-Healing Framework. The development process was focused on creating an autonomous system that can detect UI failures, analyze the changes using weighted heuristics, and self-correct without human intervention unless the confidence score is critically low.</w:t>
+      </w:r>
+    </w:p>
+    <w:p/>
+    <w:p>
+      <w:pPr>
+        <w:pStyle w:val="Heading2"/>
+      </w:pPr>
+      <w:bookmarkStart w:id="27" w:name="_Toc236342466"/>
+      <w:r>
+        <w:t>System Design</w:t>
+      </w:r>
       <w:bookmarkEnd w:id="27"/>
     </w:p>
     <w:p>
       <w:r>
-        <w:t>This chapter describes the systematic approach followed to develop the Rule-Based Self-Healing Framework. The development process was focused on creating an autonomous system that can detect UI failures, analyze the changes using weighted heuristics, and self-correct without human intervention unless the confidence score is critically low.</w:t>
-      </w:r>
-    </w:p>
-    <w:p/>
-    <w:p>
-      <w:pPr>
-        <w:pStyle w:val="Heading2"/>
-      </w:pPr>
-      <w:bookmarkStart w:id="28" w:name="_Toc236342466"/>
-      <w:r>
-        <w:t>System Design</w:t>
+        <w:t>The framework is designed with a</w:t>
+      </w:r>
+      <w:r>
+        <w:t xml:space="preserve"> layered</w:t>
+      </w:r>
+      <w:r>
+        <w:t xml:space="preserve"> architecture to separate the execution of automation scripts from the intelligent recovery logic.</w:t>
+      </w:r>
+    </w:p>
+    <w:p>
+      <w:pPr>
+        <w:pStyle w:val="Heading3"/>
+      </w:pPr>
+      <w:bookmarkStart w:id="28" w:name="_Toc236342467"/>
+      <w:r>
+        <w:t>Architectural Block Diagram</w:t>
       </w:r>
       <w:bookmarkEnd w:id="28"/>
-    </w:p>
-    <w:p>
-      <w:r>
-        <w:t>The framework is designed with a modular architecture to separate the execution of automation scripts from the intelligent recovery logic.</w:t>
-      </w:r>
-    </w:p>
-    <w:p>
-      <w:pPr>
-        <w:pStyle w:val="Heading3"/>
-      </w:pPr>
-      <w:bookmarkStart w:id="29" w:name="_Toc236342467"/>
-      <w:r>
-        <w:t>Architectural Block Diagram</w:t>
-      </w:r>
-      <w:bookmarkEnd w:id="29"/>
     </w:p>
     <w:p>
       <w:r>
@@ -8624,7 +8570,7 @@
           <w:szCs w:val="24"/>
         </w:rPr>
       </w:pPr>
-      <w:bookmarkStart w:id="30" w:name="_Toc236342523"/>
+      <w:bookmarkStart w:id="29" w:name="_Toc236342523"/>
       <w:r>
         <w:rPr>
           <w:color w:val="000000" w:themeColor="text1"/>
@@ -8731,18 +8677,18 @@
         </w:rPr>
         <w:t>: Architectural Block Diagram of Self-Healing System</w:t>
       </w:r>
-      <w:bookmarkEnd w:id="30"/>
+      <w:bookmarkEnd w:id="29"/>
     </w:p>
     <w:p>
       <w:pPr>
         <w:pStyle w:val="Heading3"/>
       </w:pPr>
-      <w:bookmarkStart w:id="31" w:name="_Toc236342468"/>
+      <w:bookmarkStart w:id="30" w:name="_Toc236342468"/>
       <w:r>
         <w:lastRenderedPageBreak/>
         <w:t>Five Layered Architecture</w:t>
       </w:r>
-      <w:bookmarkEnd w:id="31"/>
+      <w:bookmarkEnd w:id="30"/>
     </w:p>
     <w:p>
       <w:pPr>
@@ -9222,7 +9168,7 @@
       <w:pPr>
         <w:pStyle w:val="Heading2"/>
       </w:pPr>
-      <w:bookmarkStart w:id="32" w:name="_Toc236342469"/>
+      <w:bookmarkStart w:id="31" w:name="_Toc236342469"/>
       <w:r>
         <w:lastRenderedPageBreak/>
         <w:t>Data Modeling</w:t>
@@ -9233,17 +9179,17 @@
       <w:r>
         <w:t>Entity-Relationship Design</w:t>
       </w:r>
+      <w:bookmarkEnd w:id="31"/>
+    </w:p>
+    <w:p>
+      <w:pPr>
+        <w:pStyle w:val="Heading3"/>
+      </w:pPr>
+      <w:bookmarkStart w:id="32" w:name="_Toc236342470"/>
+      <w:r>
+        <w:t>ER-Diagram</w:t>
+      </w:r>
       <w:bookmarkEnd w:id="32"/>
-    </w:p>
-    <w:p>
-      <w:pPr>
-        <w:pStyle w:val="Heading3"/>
-      </w:pPr>
-      <w:bookmarkStart w:id="33" w:name="_Toc236342470"/>
-      <w:r>
-        <w:t>ER-Diagram</w:t>
-      </w:r>
-      <w:bookmarkEnd w:id="33"/>
     </w:p>
     <w:p/>
     <w:p>
@@ -9256,10 +9202,10 @@
           <w:noProof/>
         </w:rPr>
         <w:drawing>
-          <wp:inline distT="0" distB="0" distL="0" distR="0" wp14:anchorId="0F74647A" wp14:editId="30427A14">
-            <wp:extent cx="5502910" cy="3145155"/>
-            <wp:effectExtent l="0" t="0" r="2540" b="0"/>
-            <wp:docPr id="335084052" name="Picture 1"/>
+          <wp:inline distT="0" distB="0" distL="0" distR="0" wp14:anchorId="5CD387AE" wp14:editId="45B46678">
+            <wp:extent cx="6010910" cy="3081867"/>
+            <wp:effectExtent l="0" t="0" r="8890" b="4445"/>
+            <wp:docPr id="1289337943" name="Picture 2"/>
             <wp:cNvGraphicFramePr>
               <a:graphicFrameLocks xmlns:a="http://schemas.openxmlformats.org/drawingml/2006/main" noChangeAspect="1"/>
             </wp:cNvGraphicFramePr>
@@ -9267,7 +9213,7 @@
               <a:graphicData uri="http://schemas.openxmlformats.org/drawingml/2006/picture">
                 <pic:pic xmlns:pic="http://schemas.openxmlformats.org/drawingml/2006/picture">
                   <pic:nvPicPr>
-                    <pic:cNvPr id="0" name="Picture 1"/>
+                    <pic:cNvPr id="0" name="Picture 6"/>
                     <pic:cNvPicPr>
                       <a:picLocks noChangeAspect="1" noChangeArrowheads="1"/>
                     </pic:cNvPicPr>
@@ -9288,7 +9234,7 @@
                   <pic:spPr bwMode="auto">
                     <a:xfrm>
                       <a:off x="0" y="0"/>
-                      <a:ext cx="5502910" cy="3145155"/>
+                      <a:ext cx="6023780" cy="3088465"/>
                     </a:xfrm>
                     <a:prstGeom prst="rect">
                       <a:avLst/>
@@ -9308,7 +9254,7 @@
     <w:p>
       <w:pPr>
         <w:pStyle w:val="Caption"/>
-        <w:spacing w:line="360" w:lineRule="auto"/>
+        <w:spacing w:after="0" w:line="360" w:lineRule="auto"/>
         <w:jc w:val="center"/>
         <w:rPr>
           <w:color w:val="000000" w:themeColor="text1"/>
@@ -9316,7 +9262,7 @@
           <w:szCs w:val="24"/>
         </w:rPr>
       </w:pPr>
-      <w:bookmarkStart w:id="34" w:name="_Toc236342524"/>
+      <w:bookmarkStart w:id="33" w:name="_Toc236342524"/>
       <w:r>
         <w:rPr>
           <w:color w:val="000000" w:themeColor="text1"/>
@@ -9423,7 +9369,7 @@
         </w:rPr>
         <w:t>: ER-Diagram of Self-Healing System</w:t>
       </w:r>
-      <w:bookmarkEnd w:id="34"/>
+      <w:bookmarkEnd w:id="33"/>
     </w:p>
     <w:p>
       <w:pPr>
@@ -9796,11 +9742,9 @@
       <w:r>
         <w:t xml:space="preserve"> (</w:t>
       </w:r>
-      <w:proofErr w:type="gramStart"/>
-      <w:r>
-        <w:t>1:N</w:t>
-      </w:r>
-      <w:proofErr w:type="gramEnd"/>
+      <w:r>
+        <w:t>1: N</w:t>
+      </w:r>
       <w:r>
         <w:t>) many Locators, which allows the original and the repaired locator to coexist and be compared.</w:t>
       </w:r>
@@ -9938,11 +9882,9 @@
       <w:r>
         <w:t xml:space="preserve"> produces (</w:t>
       </w:r>
-      <w:proofErr w:type="gramStart"/>
-      <w:r>
-        <w:t>1:N</w:t>
-      </w:r>
-      <w:proofErr w:type="gramEnd"/>
+      <w:r>
+        <w:t>1: N</w:t>
+      </w:r>
       <w:r>
         <w:t xml:space="preserve">) many </w:t>
       </w:r>
@@ -10045,11 +9987,9 @@
       <w:r>
         <w:t xml:space="preserve"> by a One-to-Many (</w:t>
       </w:r>
-      <w:proofErr w:type="gramStart"/>
-      <w:r>
-        <w:t>1:N</w:t>
-      </w:r>
-      <w:proofErr w:type="gramEnd"/>
+      <w:r>
+        <w:t>1: N</w:t>
+      </w:r>
       <w:r>
         <w:t xml:space="preserve">) relationship named </w:t>
       </w:r>
@@ -10120,25 +10060,36 @@
       <w:r>
         <w:t xml:space="preserve"> (</w:t>
       </w:r>
+      <w:r>
+        <w:t>1: N</w:t>
+      </w:r>
+      <w:r>
+        <w:t xml:space="preserve">) the </w:t>
+      </w:r>
+      <w:proofErr w:type="spellStart"/>
       <w:proofErr w:type="gramStart"/>
       <w:r>
-        <w:t>1:N</w:t>
+        <w:t>Admin</w:t>
       </w:r>
       <w:proofErr w:type="gramEnd"/>
       <w:r>
-        <w:t xml:space="preserve">) the </w:t>
+        <w:t>_Log</w:t>
+      </w:r>
+      <w:proofErr w:type="spellEnd"/>
+      <w:r>
+        <w:t xml:space="preserve">. Attributes: </w:t>
       </w:r>
       <w:proofErr w:type="spellStart"/>
       <w:r>
-        <w:t>Admin_Log</w:t>
+        <w:t>log_id</w:t>
       </w:r>
       <w:proofErr w:type="spellEnd"/>
       <w:r>
-        <w:t xml:space="preserve">. Attributes: </w:t>
+        <w:t xml:space="preserve">, </w:t>
       </w:r>
       <w:proofErr w:type="spellStart"/>
       <w:r>
-        <w:t>log_id</w:t>
+        <w:t>severity_level</w:t>
       </w:r>
       <w:proofErr w:type="spellEnd"/>
       <w:r>
@@ -10146,43 +10097,36 @@
       </w:r>
       <w:proofErr w:type="spellStart"/>
       <w:r>
-        <w:t>severity_level</w:t>
+        <w:t>resolution_summary</w:t>
       </w:r>
       <w:proofErr w:type="spellEnd"/>
       <w:r>
-        <w:t xml:space="preserve">, </w:t>
-      </w:r>
-      <w:proofErr w:type="spellStart"/>
-      <w:r>
-        <w:t>resolution_summary</w:t>
-      </w:r>
-      <w:proofErr w:type="spellEnd"/>
-      <w:r>
         <w:t>, recommendation.</w:t>
       </w:r>
     </w:p>
+    <w:p/>
     <w:p>
       <w:pPr>
         <w:pStyle w:val="Heading2"/>
       </w:pPr>
-      <w:bookmarkStart w:id="35" w:name="_Toc236342471"/>
+      <w:bookmarkStart w:id="34" w:name="_Toc236342471"/>
       <w:r>
         <w:t>Heu</w:t>
       </w:r>
       <w:r>
         <w:t>ristic Scoring and Decision Logic</w:t>
       </w:r>
+      <w:bookmarkEnd w:id="34"/>
+    </w:p>
+    <w:p>
+      <w:pPr>
+        <w:pStyle w:val="Heading3"/>
+      </w:pPr>
+      <w:bookmarkStart w:id="35" w:name="_Toc236342472"/>
+      <w:r>
+        <w:t>Logic Flowchart</w:t>
+      </w:r>
       <w:bookmarkEnd w:id="35"/>
-    </w:p>
-    <w:p>
-      <w:pPr>
-        <w:pStyle w:val="Heading3"/>
-      </w:pPr>
-      <w:bookmarkStart w:id="36" w:name="_Toc236342472"/>
-      <w:r>
-        <w:t>Logic Flowchart</w:t>
-      </w:r>
-      <w:bookmarkEnd w:id="36"/>
     </w:p>
     <w:p>
       <w:r>
@@ -10284,7 +10228,7 @@
           <w:szCs w:val="24"/>
         </w:rPr>
       </w:pPr>
-      <w:bookmarkStart w:id="37" w:name="_Toc236342525"/>
+      <w:bookmarkStart w:id="36" w:name="_Toc236342525"/>
       <w:r>
         <w:rPr>
           <w:color w:val="000000" w:themeColor="text1"/>
@@ -10399,7 +10343,7 @@
         </w:rPr>
         <w:t>Logic Flowchart of Self-Healing System</w:t>
       </w:r>
-      <w:bookmarkEnd w:id="37"/>
+      <w:bookmarkEnd w:id="36"/>
     </w:p>
     <w:p>
       <w:r>
@@ -10492,11 +10436,9 @@
       <w:r>
         <w:t xml:space="preserve"> attributes of the winning live </w:t>
       </w:r>
-      <w:proofErr w:type="spellStart"/>
-      <w:r>
-        <w:t>elementare</w:t>
-      </w:r>
-      <w:proofErr w:type="spellEnd"/>
+      <w:r>
+        <w:t>elementary</w:t>
+      </w:r>
       <w:r>
         <w:t xml:space="preserve"> extracted and ranked by stability, and the highest-ranked attribute is expressed as the repaired locator.</w:t>
       </w:r>
@@ -10512,19 +10454,15 @@
       <w:r>
         <w:t xml:space="preserve"> Locator Update and Resume. The </w:t>
       </w:r>
-      <w:proofErr w:type="spellStart"/>
-      <w:r>
-        <w:t>loupdated</w:t>
-      </w:r>
-      <w:proofErr w:type="spellEnd"/>
+      <w:r>
+        <w:t>update</w:t>
+      </w:r>
       <w:r>
         <w:t xml:space="preserve"> with the repaired locator </w:t>
       </w:r>
-      <w:proofErr w:type="spellStart"/>
-      <w:r>
-        <w:t>andexecution</w:t>
-      </w:r>
-      <w:proofErr w:type="spellEnd"/>
+      <w:r>
+        <w:t>and execution</w:t>
+      </w:r>
       <w:r>
         <w:t xml:space="preserve"> resumes with the recovered element. The application under test is not modified at any point in this flow.</w:t>
       </w:r>
@@ -10559,11 +10497,11 @@
       <w:pPr>
         <w:pStyle w:val="Heading3"/>
       </w:pPr>
-      <w:bookmarkStart w:id="38" w:name="_Toc236342473"/>
+      <w:bookmarkStart w:id="37" w:name="_Toc236342473"/>
       <w:r>
         <w:t>Scoring Algorithm Table</w:t>
       </w:r>
-      <w:bookmarkEnd w:id="38"/>
+      <w:bookmarkEnd w:id="37"/>
     </w:p>
     <w:p>
       <w:r>
@@ -10572,19 +10510,15 @@
       <w:r>
         <w:t>“</w:t>
       </w:r>
-      <w:proofErr w:type="spellStart"/>
-      <w:proofErr w:type="gramStart"/>
       <w:r>
         <w:t>Self</w:t>
       </w:r>
       <w:r>
-        <w:t>:</w:t>
+        <w:t>-</w:t>
       </w:r>
       <w:r>
         <w:t>Healing</w:t>
       </w:r>
-      <w:proofErr w:type="spellEnd"/>
-      <w:proofErr w:type="gramEnd"/>
       <w:r>
         <w:t>”</w:t>
       </w:r>
@@ -10616,7 +10550,7 @@
           <w:szCs w:val="24"/>
         </w:rPr>
       </w:pPr>
-      <w:bookmarkStart w:id="39" w:name="_Toc236342534"/>
+      <w:bookmarkStart w:id="38" w:name="_Toc236342534"/>
       <w:r>
         <w:rPr>
           <w:color w:val="000000" w:themeColor="text1"/>
@@ -10723,7 +10657,7 @@
         </w:rPr>
         <w:t>: Heuristic Scoring Algorithm Table</w:t>
       </w:r>
-      <w:bookmarkEnd w:id="39"/>
+      <w:bookmarkEnd w:id="38"/>
     </w:p>
     <w:tbl>
       <w:tblPr>
@@ -11282,19 +11216,15 @@
       <w:r>
         <w:t xml:space="preserve"> that rule is excluded from the calculation and the remaining weights are </w:t>
       </w:r>
-      <w:proofErr w:type="spellStart"/>
-      <w:r>
-        <w:t>normalised</w:t>
-      </w:r>
-      <w:proofErr w:type="spellEnd"/>
+      <w:r>
+        <w:t>normalized</w:t>
+      </w:r>
       <w:r>
         <w:t xml:space="preserve">, so that the absence of an attribute is not scored as a mismatch. Candidates whose tag family differs from the fingerprint are heavily </w:t>
       </w:r>
-      <w:proofErr w:type="spellStart"/>
-      <w:r>
-        <w:t>penalised</w:t>
-      </w:r>
-      <w:proofErr w:type="spellEnd"/>
+      <w:r>
+        <w:t>penalized</w:t>
+      </w:r>
       <w:r>
         <w:t>. An automatic heal additionally requires the winning candidate to exceed the next-best candidate by a minimum margin, so that a page containing two similar elements cannot produce a confident but incorrect substitution.</w:t>
       </w:r>
@@ -11369,45 +11299,27 @@
       <w:pPr>
         <w:pStyle w:val="Heading2"/>
       </w:pPr>
-      <w:bookmarkStart w:id="40" w:name="_Toc236342474"/>
+      <w:bookmarkStart w:id="39" w:name="_Toc236342474"/>
       <w:r>
         <w:t>System Operational Workflow</w:t>
       </w:r>
-      <w:bookmarkEnd w:id="40"/>
+      <w:bookmarkEnd w:id="39"/>
     </w:p>
     <w:p>
       <w:r>
         <w:t xml:space="preserve">The System Operational Workflow describes the chronological execution behavior of the </w:t>
       </w:r>
-      <w:proofErr w:type="spellStart"/>
-      <w:proofErr w:type="gramStart"/>
-      <w:r>
-        <w:t>Rule</w:t>
-      </w:r>
-      <w:r>
-        <w:t>:</w:t>
-      </w:r>
-      <w:r>
-        <w:t>Based</w:t>
-      </w:r>
-      <w:proofErr w:type="spellEnd"/>
-      <w:proofErr w:type="gramEnd"/>
-      <w:r>
-        <w:t xml:space="preserve"> </w:t>
-      </w:r>
-      <w:proofErr w:type="spellStart"/>
-      <w:r>
-        <w:t>Self</w:t>
-      </w:r>
-      <w:r>
-        <w:t>:</w:t>
-      </w:r>
-      <w:r>
-        <w:t>Healing</w:t>
-      </w:r>
-      <w:proofErr w:type="spellEnd"/>
-      <w:r>
-        <w:t xml:space="preserve"> Framework. Unlike architectural diagrams that describe structural components, this section explains how the system behaves over time from initialization to recovery.</w:t>
+      <w:r>
+        <w:t>Rule Based</w:t>
+      </w:r>
+      <w:r>
+        <w:t xml:space="preserve"> Self</w:t>
+      </w:r>
+      <w:r>
+        <w:t>-</w:t>
+      </w:r>
+      <w:r>
+        <w:t>Healing Framework. Unlike architectural diagrams that describe structural components, this section explains how the system behaves over time from initialization to recovery.</w:t>
       </w:r>
     </w:p>
     <w:p>
@@ -11448,11 +11360,11 @@
       <w:pPr>
         <w:pStyle w:val="Heading3"/>
       </w:pPr>
-      <w:bookmarkStart w:id="41" w:name="_Toc236342475"/>
+      <w:bookmarkStart w:id="40" w:name="_Toc236342475"/>
       <w:r>
         <w:t>Operational Lifecycle</w:t>
       </w:r>
-      <w:bookmarkEnd w:id="41"/>
+      <w:bookmarkEnd w:id="40"/>
     </w:p>
     <w:p>
       <w:r>
@@ -11538,7 +11450,6 @@
         </w:numPr>
       </w:pPr>
       <w:r>
-        <w:lastRenderedPageBreak/>
         <w:t>The quality assurance engineer runs exactly the same test script, unmodified.</w:t>
       </w:r>
     </w:p>
@@ -11551,6 +11462,7 @@
         </w:numPr>
       </w:pPr>
       <w:r>
+        <w:lastRenderedPageBreak/>
         <w:t xml:space="preserve">Selenium fails to resolve the affected locator and raises a </w:t>
       </w:r>
       <w:proofErr w:type="spellStart"/>
@@ -11607,11 +11519,11 @@
       <w:pPr>
         <w:pStyle w:val="Heading3"/>
       </w:pPr>
-      <w:bookmarkStart w:id="42" w:name="_Toc236342476"/>
+      <w:bookmarkStart w:id="41" w:name="_Toc236342476"/>
       <w:r>
         <w:t>Learning Mode Workflow</w:t>
       </w:r>
-      <w:bookmarkEnd w:id="42"/>
+      <w:bookmarkEnd w:id="41"/>
     </w:p>
     <w:p>
       <w:pPr>
@@ -11724,7 +11636,7 @@
           <w:szCs w:val="28"/>
         </w:rPr>
       </w:pPr>
-      <w:bookmarkStart w:id="43" w:name="_Toc236342526"/>
+      <w:bookmarkStart w:id="42" w:name="_Toc236342526"/>
       <w:r>
         <w:rPr>
           <w:sz w:val="24"/>
@@ -11818,7 +11730,7 @@
         </w:rPr>
         <w:t>: Learning Mode Workflow</w:t>
       </w:r>
-      <w:bookmarkEnd w:id="43"/>
+      <w:bookmarkEnd w:id="42"/>
       <w:r>
         <w:rPr>
           <w:b/>
@@ -11831,12 +11743,12 @@
       <w:pPr>
         <w:pStyle w:val="Heading3"/>
       </w:pPr>
-      <w:bookmarkStart w:id="44" w:name="_Toc236342477"/>
+      <w:bookmarkStart w:id="43" w:name="_Toc236342477"/>
       <w:r>
         <w:lastRenderedPageBreak/>
         <w:t>Healing Mode Workflow</w:t>
       </w:r>
-      <w:bookmarkEnd w:id="44"/>
+      <w:bookmarkEnd w:id="43"/>
     </w:p>
     <w:p>
       <w:r>
@@ -12210,7 +12122,7 @@
           <w:szCs w:val="24"/>
         </w:rPr>
       </w:pPr>
-      <w:bookmarkStart w:id="45" w:name="_Toc236342527"/>
+      <w:bookmarkStart w:id="44" w:name="_Toc236342527"/>
       <w:r>
         <w:rPr>
           <w:color w:val="000000" w:themeColor="text1"/>
@@ -12325,7 +12237,7 @@
         </w:rPr>
         <w:t xml:space="preserve"> Healing Mode Flowchart</w:t>
       </w:r>
-      <w:bookmarkEnd w:id="45"/>
+      <w:bookmarkEnd w:id="44"/>
       <w:r>
         <w:rPr>
           <w:b/>
@@ -12338,12 +12250,12 @@
       <w:pPr>
         <w:pStyle w:val="Heading3"/>
       </w:pPr>
-      <w:bookmarkStart w:id="46" w:name="_Toc236342478"/>
+      <w:bookmarkStart w:id="45" w:name="_Toc236342478"/>
       <w:r>
         <w:lastRenderedPageBreak/>
         <w:t>Feedback and Update Cycle</w:t>
       </w:r>
-      <w:bookmarkEnd w:id="46"/>
+      <w:bookmarkEnd w:id="45"/>
     </w:p>
     <w:p>
       <w:r>
@@ -12623,7 +12535,7 @@
           <w:szCs w:val="24"/>
         </w:rPr>
       </w:pPr>
-      <w:bookmarkStart w:id="47" w:name="_Toc236342528"/>
+      <w:bookmarkStart w:id="46" w:name="_Toc236342528"/>
       <w:r>
         <w:rPr>
           <w:color w:val="000000" w:themeColor="text1"/>
@@ -12738,7 +12650,7 @@
         </w:rPr>
         <w:t xml:space="preserve"> Close looped feedback and update cycle</w:t>
       </w:r>
-      <w:bookmarkEnd w:id="47"/>
+      <w:bookmarkEnd w:id="46"/>
     </w:p>
     <w:p>
       <w:pPr>
@@ -12759,12 +12671,12 @@
       <w:pPr>
         <w:pStyle w:val="Heading3"/>
       </w:pPr>
-      <w:bookmarkStart w:id="48" w:name="_Toc236342479"/>
+      <w:bookmarkStart w:id="47" w:name="_Toc236342479"/>
       <w:r>
         <w:lastRenderedPageBreak/>
         <w:t>Integration with an Existing Test Suite</w:t>
       </w:r>
-      <w:bookmarkEnd w:id="48"/>
+      <w:bookmarkEnd w:id="47"/>
     </w:p>
     <w:p>
       <w:r>
@@ -12943,12 +12855,12 @@
       <w:pPr>
         <w:pStyle w:val="Heading2"/>
       </w:pPr>
-      <w:bookmarkStart w:id="49" w:name="_Toc236342480"/>
+      <w:bookmarkStart w:id="48" w:name="_Toc236342480"/>
       <w:r>
         <w:lastRenderedPageBreak/>
         <w:t>Software Development Life Cycle</w:t>
       </w:r>
-      <w:bookmarkEnd w:id="49"/>
+      <w:bookmarkEnd w:id="48"/>
       <w:r>
         <w:t xml:space="preserve"> </w:t>
       </w:r>
@@ -13076,7 +12988,7 @@
         <w:spacing w:line="360" w:lineRule="auto"/>
         <w:jc w:val="center"/>
       </w:pPr>
-      <w:bookmarkStart w:id="50" w:name="_Toc236342529"/>
+      <w:bookmarkStart w:id="49" w:name="_Toc236342529"/>
       <w:r>
         <w:rPr>
           <w:color w:val="000000" w:themeColor="text1"/>
@@ -13219,7 +13131,7 @@
         </w:rPr>
         <w:t xml:space="preserve"> System</w:t>
       </w:r>
-      <w:bookmarkEnd w:id="50"/>
+      <w:bookmarkEnd w:id="49"/>
       <w:r>
         <w:br w:type="page"/>
       </w:r>
@@ -13228,12 +13140,12 @@
       <w:pPr>
         <w:pStyle w:val="Heading3"/>
       </w:pPr>
-      <w:bookmarkStart w:id="51" w:name="_Toc236342481"/>
+      <w:bookmarkStart w:id="50" w:name="_Toc236342481"/>
       <w:r>
         <w:lastRenderedPageBreak/>
         <w:t>Phases of Development</w:t>
       </w:r>
-      <w:bookmarkEnd w:id="51"/>
+      <w:bookmarkEnd w:id="50"/>
     </w:p>
     <w:p>
       <w:pPr>
@@ -13630,11 +13542,11 @@
       <w:pPr>
         <w:pStyle w:val="Heading3"/>
       </w:pPr>
-      <w:bookmarkStart w:id="52" w:name="_Toc236342482"/>
+      <w:bookmarkStart w:id="51" w:name="_Toc236342482"/>
       <w:r>
         <w:t>Why Incremental Model Fits Better</w:t>
       </w:r>
-      <w:bookmarkEnd w:id="52"/>
+      <w:bookmarkEnd w:id="51"/>
     </w:p>
     <w:p>
       <w:pPr>
@@ -13737,11 +13649,11 @@
       <w:pPr>
         <w:pStyle w:val="Heading2"/>
       </w:pPr>
-      <w:bookmarkStart w:id="53" w:name="_Toc236342483"/>
+      <w:bookmarkStart w:id="52" w:name="_Toc236342483"/>
       <w:r>
         <w:t>Technology Stack</w:t>
       </w:r>
-      <w:bookmarkEnd w:id="53"/>
+      <w:bookmarkEnd w:id="52"/>
     </w:p>
     <w:p>
       <w:r>
@@ -13825,7 +13737,7 @@
       <w:pPr>
         <w:pStyle w:val="Heading2"/>
       </w:pPr>
-      <w:bookmarkStart w:id="54" w:name="_Toc236342484"/>
+      <w:bookmarkStart w:id="53" w:name="_Toc236342484"/>
       <w:r>
         <w:t xml:space="preserve">The </w:t>
       </w:r>
@@ -13841,7 +13753,7 @@
       <w:r>
         <w:t xml:space="preserve"> Dashboard</w:t>
       </w:r>
-      <w:bookmarkEnd w:id="54"/>
+      <w:bookmarkEnd w:id="53"/>
     </w:p>
     <w:p>
       <w:r>
@@ -13983,12 +13895,12 @@
       <w:pPr>
         <w:pStyle w:val="Heading2"/>
       </w:pPr>
-      <w:bookmarkStart w:id="55" w:name="_Toc236342485"/>
+      <w:bookmarkStart w:id="54" w:name="_Toc236342485"/>
       <w:r>
         <w:lastRenderedPageBreak/>
         <w:t>Testing &amp; Evaluation</w:t>
       </w:r>
-      <w:bookmarkEnd w:id="55"/>
+      <w:bookmarkEnd w:id="54"/>
     </w:p>
     <w:p>
       <w:r>
@@ -14198,14 +14110,14 @@
           <w:lang w:val="en-GB"/>
         </w:rPr>
       </w:pPr>
-      <w:bookmarkStart w:id="56" w:name="_Toc236342486"/>
+      <w:bookmarkStart w:id="55" w:name="_Toc236342486"/>
       <w:r>
         <w:rPr>
           <w:lang w:val="en-GB"/>
         </w:rPr>
         <w:t>Hardware and Software Requirements</w:t>
       </w:r>
-      <w:bookmarkEnd w:id="56"/>
+      <w:bookmarkEnd w:id="55"/>
     </w:p>
     <w:p>
       <w:pPr>
@@ -14267,7 +14179,7 @@
           <w:lang w:val="en-GB"/>
         </w:rPr>
       </w:pPr>
-      <w:bookmarkStart w:id="57" w:name="_Toc236342487"/>
+      <w:bookmarkStart w:id="56" w:name="_Toc236342487"/>
       <w:r>
         <w:rPr>
           <w:lang w:val="en-GB"/>
@@ -14281,17 +14193,17 @@
         </w:rPr>
         <w:t>LT AND ANALYSIS</w:t>
       </w:r>
+      <w:bookmarkEnd w:id="56"/>
+    </w:p>
+    <w:p>
+      <w:pPr>
+        <w:pStyle w:val="Heading2"/>
+      </w:pPr>
+      <w:bookmarkStart w:id="57" w:name="_Toc236342488"/>
+      <w:r>
+        <w:t>Evaluation Setup</w:t>
+      </w:r>
       <w:bookmarkEnd w:id="57"/>
-    </w:p>
-    <w:p>
-      <w:pPr>
-        <w:pStyle w:val="Heading2"/>
-      </w:pPr>
-      <w:bookmarkStart w:id="58" w:name="_Toc236342488"/>
-      <w:r>
-        <w:t>Evaluation Setup</w:t>
-      </w:r>
-      <w:bookmarkEnd w:id="58"/>
     </w:p>
     <w:p>
       <w:r>
@@ -14532,7 +14444,7 @@
           <w:lang w:val="en-GB"/>
         </w:rPr>
       </w:pPr>
-      <w:bookmarkStart w:id="59" w:name="_Toc236342489"/>
+      <w:bookmarkStart w:id="58" w:name="_Toc236342489"/>
       <w:r>
         <w:rPr>
           <w:lang w:val="en-GB"/>
@@ -14546,29 +14458,29 @@
         </w:rPr>
         <w:t xml:space="preserve"> Results</w:t>
       </w:r>
+      <w:bookmarkEnd w:id="58"/>
+    </w:p>
+    <w:p>
+      <w:pPr>
+        <w:pStyle w:val="Heading3"/>
+      </w:pPr>
+      <w:bookmarkStart w:id="59" w:name="_Toc236342490"/>
+      <w:r>
+        <w:t xml:space="preserve">Baseline versus </w:t>
+      </w:r>
+      <w:r>
+        <w:t>Self</w:t>
+      </w:r>
+      <w:r>
+        <w:t>:</w:t>
+      </w:r>
+      <w:r>
+        <w:t xml:space="preserve"> Healed</w:t>
+      </w:r>
+      <w:r>
+        <w:t xml:space="preserve"> Execution</w:t>
+      </w:r>
       <w:bookmarkEnd w:id="59"/>
-    </w:p>
-    <w:p>
-      <w:pPr>
-        <w:pStyle w:val="Heading3"/>
-      </w:pPr>
-      <w:bookmarkStart w:id="60" w:name="_Toc236342490"/>
-      <w:r>
-        <w:t xml:space="preserve">Baseline versus </w:t>
-      </w:r>
-      <w:r>
-        <w:t>Self</w:t>
-      </w:r>
-      <w:r>
-        <w:t>:</w:t>
-      </w:r>
-      <w:r>
-        <w:t xml:space="preserve"> Healed</w:t>
-      </w:r>
-      <w:r>
-        <w:t xml:space="preserve"> Execution</w:t>
-      </w:r>
-      <w:bookmarkEnd w:id="60"/>
     </w:p>
     <w:p>
       <w:r>
@@ -14599,7 +14511,7 @@
           <w:szCs w:val="24"/>
         </w:rPr>
       </w:pPr>
-      <w:bookmarkStart w:id="61" w:name="_Toc236342535"/>
+      <w:bookmarkStart w:id="60" w:name="_Toc236342535"/>
       <w:r>
         <w:rPr>
           <w:color w:val="000000" w:themeColor="text1"/>
@@ -14738,7 +14650,7 @@
         </w:rPr>
         <w:t xml:space="preserve"> Execution of the Same Test Suite</w:t>
       </w:r>
-      <w:bookmarkEnd w:id="61"/>
+      <w:bookmarkEnd w:id="60"/>
     </w:p>
     <w:tbl>
       <w:tblPr>
@@ -15250,11 +15162,11 @@
       <w:pPr>
         <w:pStyle w:val="Heading3"/>
       </w:pPr>
-      <w:bookmarkStart w:id="62" w:name="_Toc236342491"/>
+      <w:bookmarkStart w:id="61" w:name="_Toc236342491"/>
       <w:r>
         <w:t>Confidence Scoring and Rule Contributions</w:t>
       </w:r>
-      <w:bookmarkEnd w:id="62"/>
+      <w:bookmarkEnd w:id="61"/>
     </w:p>
     <w:p>
       <w:r>
@@ -15281,7 +15193,7 @@
           <w:szCs w:val="24"/>
         </w:rPr>
       </w:pPr>
-      <w:bookmarkStart w:id="63" w:name="_Toc236342536"/>
+      <w:bookmarkStart w:id="62" w:name="_Toc236342536"/>
       <w:r>
         <w:rPr>
           <w:color w:val="000000" w:themeColor="text1"/>
@@ -15388,7 +15300,7 @@
         </w:rPr>
         <w:t>: Confidence Scores and Rule Contributions for Each Healed Element</w:t>
       </w:r>
-      <w:bookmarkEnd w:id="63"/>
+      <w:bookmarkEnd w:id="62"/>
     </w:p>
     <w:tbl>
       <w:tblPr>
@@ -16008,7 +15920,7 @@
           <w:szCs w:val="24"/>
         </w:rPr>
       </w:pPr>
-      <w:bookmarkStart w:id="64" w:name="_Toc236342530"/>
+      <w:bookmarkStart w:id="63" w:name="_Toc236342530"/>
       <w:r>
         <w:rPr>
           <w:color w:val="000000" w:themeColor="text1"/>
@@ -16131,13 +16043,13 @@
         </w:rPr>
         <w:t xml:space="preserve"> Heuristic Healing tab, showing each heal with its confidence score and R1–R4 breakdown</w:t>
       </w:r>
-      <w:bookmarkEnd w:id="64"/>
+      <w:bookmarkEnd w:id="63"/>
     </w:p>
     <w:p>
       <w:pPr>
         <w:pStyle w:val="Heading3"/>
       </w:pPr>
-      <w:bookmarkStart w:id="65" w:name="_Toc236342492"/>
+      <w:bookmarkStart w:id="64" w:name="_Toc236342492"/>
       <w:r>
         <w:t xml:space="preserve">Isolated </w:t>
       </w:r>
@@ -16157,7 +16069,7 @@
       <w:r>
         <w:t xml:space="preserve"> Change Scenarios</w:t>
       </w:r>
-      <w:bookmarkEnd w:id="65"/>
+      <w:bookmarkEnd w:id="64"/>
     </w:p>
     <w:p>
       <w:r>
@@ -16192,7 +16104,7 @@
           <w:szCs w:val="24"/>
         </w:rPr>
       </w:pPr>
-      <w:bookmarkStart w:id="66" w:name="_Toc236342537"/>
+      <w:bookmarkStart w:id="65" w:name="_Toc236342537"/>
       <w:r>
         <w:rPr>
           <w:color w:val="000000" w:themeColor="text1"/>
@@ -16335,7 +16247,7 @@
         </w:rPr>
         <w:t xml:space="preserve"> Change Scenarios</w:t>
       </w:r>
-      <w:bookmarkEnd w:id="66"/>
+      <w:bookmarkEnd w:id="65"/>
     </w:p>
     <w:tbl>
       <w:tblPr>
@@ -17242,7 +17154,7 @@
       <w:pPr>
         <w:pStyle w:val="Heading3"/>
       </w:pPr>
-      <w:bookmarkStart w:id="67" w:name="_Toc236342493"/>
+      <w:bookmarkStart w:id="66" w:name="_Toc236342493"/>
       <w:r>
         <w:t xml:space="preserve">Permanent </w:t>
       </w:r>
@@ -17272,7 +17184,7 @@
       <w:r>
         <w:t>Correction</w:t>
       </w:r>
-      <w:bookmarkEnd w:id="67"/>
+      <w:bookmarkEnd w:id="66"/>
       <w:proofErr w:type="spellEnd"/>
     </w:p>
     <w:p>
@@ -17498,7 +17410,7 @@
           <w:szCs w:val="24"/>
         </w:rPr>
       </w:pPr>
-      <w:bookmarkStart w:id="68" w:name="_Toc236342531"/>
+      <w:bookmarkStart w:id="67" w:name="_Toc236342531"/>
       <w:r>
         <w:rPr>
           <w:color w:val="000000" w:themeColor="text1"/>
@@ -17657,13 +17569,13 @@
         </w:rPr>
         <w:t xml:space="preserve"> tab, showing the healed locator written back to the automation source</w:t>
       </w:r>
-      <w:bookmarkEnd w:id="68"/>
+      <w:bookmarkEnd w:id="67"/>
     </w:p>
     <w:p>
       <w:pPr>
         <w:pStyle w:val="Heading3"/>
       </w:pPr>
-      <w:bookmarkStart w:id="69" w:name="_Toc236342494"/>
+      <w:bookmarkStart w:id="68" w:name="_Toc236342494"/>
       <w:proofErr w:type="spellStart"/>
       <w:proofErr w:type="gramStart"/>
       <w:r>
@@ -17680,7 +17592,7 @@
       <w:r>
         <w:t xml:space="preserve"> Healing</w:t>
       </w:r>
-      <w:bookmarkEnd w:id="69"/>
+      <w:bookmarkEnd w:id="68"/>
     </w:p>
     <w:p>
       <w:r>
@@ -17731,11 +17643,11 @@
       <w:pPr>
         <w:pStyle w:val="Heading3"/>
       </w:pPr>
-      <w:bookmarkStart w:id="70" w:name="_Toc236342495"/>
+      <w:bookmarkStart w:id="69" w:name="_Toc236342495"/>
       <w:r>
         <w:t>Baseline Recovery After Fingerprint Loss</w:t>
       </w:r>
-      <w:bookmarkEnd w:id="70"/>
+      <w:bookmarkEnd w:id="69"/>
     </w:p>
     <w:p>
       <w:r>
@@ -17749,7 +17661,7 @@
           <w:lang w:val="en-GB"/>
         </w:rPr>
       </w:pPr>
-      <w:bookmarkStart w:id="71" w:name="_Toc236342496"/>
+      <w:bookmarkStart w:id="70" w:name="_Toc236342496"/>
       <w:r>
         <w:rPr>
           <w:lang w:val="en-GB"/>
@@ -17785,7 +17697,7 @@
         </w:rPr>
         <w:t xml:space="preserve"> Halt</w:t>
       </w:r>
-      <w:bookmarkEnd w:id="71"/>
+      <w:bookmarkEnd w:id="70"/>
     </w:p>
     <w:p>
       <w:r>
@@ -17957,7 +17869,7 @@
           <w:szCs w:val="24"/>
         </w:rPr>
       </w:pPr>
-      <w:bookmarkStart w:id="72" w:name="_Toc236342532"/>
+      <w:bookmarkStart w:id="71" w:name="_Toc236342532"/>
       <w:r>
         <w:rPr>
           <w:color w:val="000000" w:themeColor="text1"/>
@@ -18116,7 +18028,7 @@
         </w:rPr>
         <w:t xml:space="preserve"> refusal recorded as a critical entry</w:t>
       </w:r>
-      <w:bookmarkEnd w:id="72"/>
+      <w:bookmarkEnd w:id="71"/>
     </w:p>
     <w:p>
       <w:pPr>
@@ -18125,7 +18037,7 @@
           <w:lang w:val="en-GB"/>
         </w:rPr>
       </w:pPr>
-      <w:bookmarkStart w:id="73" w:name="_Toc236342497"/>
+      <w:bookmarkStart w:id="72" w:name="_Toc236342497"/>
       <w:r>
         <w:rPr>
           <w:lang w:val="en-GB"/>
@@ -18139,7 +18051,7 @@
         </w:rPr>
         <w:t xml:space="preserve"> Results</w:t>
       </w:r>
-      <w:bookmarkEnd w:id="73"/>
+      <w:bookmarkEnd w:id="72"/>
     </w:p>
     <w:p>
       <w:r>
@@ -18321,7 +18233,7 @@
           <w:szCs w:val="24"/>
         </w:rPr>
       </w:pPr>
-      <w:bookmarkStart w:id="74" w:name="_Toc236342533"/>
+      <w:bookmarkStart w:id="73" w:name="_Toc236342533"/>
       <w:r>
         <w:rPr>
           <w:color w:val="000000" w:themeColor="text1"/>
@@ -18480,7 +18392,7 @@
         </w:rPr>
         <w:t xml:space="preserve"> recovery action and its trigger metrics</w:t>
       </w:r>
-      <w:bookmarkEnd w:id="74"/>
+      <w:bookmarkEnd w:id="73"/>
     </w:p>
     <w:p>
       <w:pPr>
@@ -18489,7 +18401,7 @@
           <w:lang w:val="en-GB"/>
         </w:rPr>
       </w:pPr>
-      <w:bookmarkStart w:id="75" w:name="_Toc236342498"/>
+      <w:bookmarkStart w:id="74" w:name="_Toc236342498"/>
       <w:proofErr w:type="spellStart"/>
       <w:proofErr w:type="gramStart"/>
       <w:r>
@@ -18518,7 +18430,7 @@
         </w:rPr>
         <w:t xml:space="preserve"> Anomaly Detection</w:t>
       </w:r>
-      <w:bookmarkEnd w:id="75"/>
+      <w:bookmarkEnd w:id="74"/>
     </w:p>
     <w:p>
       <w:r>
@@ -18583,14 +18495,14 @@
           <w:lang w:val="en-GB"/>
         </w:rPr>
       </w:pPr>
-      <w:bookmarkStart w:id="76" w:name="_Toc236342499"/>
+      <w:bookmarkStart w:id="75" w:name="_Toc236342499"/>
       <w:r>
         <w:rPr>
           <w:lang w:val="en-GB"/>
         </w:rPr>
         <w:t>Automated Verification Harness</w:t>
       </w:r>
-      <w:bookmarkEnd w:id="76"/>
+      <w:bookmarkEnd w:id="75"/>
     </w:p>
     <w:p>
       <w:r>
@@ -18625,7 +18537,7 @@
           <w:szCs w:val="24"/>
         </w:rPr>
       </w:pPr>
-      <w:bookmarkStart w:id="77" w:name="_Toc236342538"/>
+      <w:bookmarkStart w:id="76" w:name="_Toc236342538"/>
       <w:r>
         <w:rPr>
           <w:color w:val="000000" w:themeColor="text1"/>
@@ -18732,7 +18644,7 @@
         </w:rPr>
         <w:t>: Automated Verification Harness Results</w:t>
       </w:r>
-      <w:bookmarkEnd w:id="77"/>
+      <w:bookmarkEnd w:id="76"/>
     </w:p>
     <w:tbl>
       <w:tblPr>
@@ -19275,14 +19187,14 @@
           <w:lang w:val="en-GB"/>
         </w:rPr>
       </w:pPr>
-      <w:bookmarkStart w:id="78" w:name="_Toc236342500"/>
+      <w:bookmarkStart w:id="77" w:name="_Toc236342500"/>
       <w:r>
         <w:rPr>
           <w:lang w:val="en-GB"/>
         </w:rPr>
         <w:t>Consolidated Results</w:t>
       </w:r>
-      <w:bookmarkEnd w:id="78"/>
+      <w:bookmarkEnd w:id="77"/>
     </w:p>
     <w:p>
       <w:r>
@@ -19301,7 +19213,7 @@
           <w:szCs w:val="24"/>
         </w:rPr>
       </w:pPr>
-      <w:bookmarkStart w:id="79" w:name="_Toc236342539"/>
+      <w:bookmarkStart w:id="78" w:name="_Toc236342539"/>
       <w:r>
         <w:rPr>
           <w:color w:val="000000" w:themeColor="text1"/>
@@ -19408,7 +19320,7 @@
         </w:rPr>
         <w:t>: Demonstrated Outcomes Across All Three Fault Domains</w:t>
       </w:r>
-      <w:bookmarkEnd w:id="79"/>
+      <w:bookmarkEnd w:id="78"/>
     </w:p>
     <w:tbl>
       <w:tblPr>
@@ -20826,14 +20738,14 @@
           <w:lang w:val="en-GB"/>
         </w:rPr>
       </w:pPr>
-      <w:bookmarkStart w:id="80" w:name="_Toc236342501"/>
+      <w:bookmarkStart w:id="79" w:name="_Toc236342501"/>
       <w:r>
         <w:rPr>
           <w:lang w:val="en-GB"/>
         </w:rPr>
         <w:t>Analysis</w:t>
       </w:r>
-      <w:bookmarkEnd w:id="80"/>
+      <w:bookmarkEnd w:id="79"/>
     </w:p>
     <w:p>
       <w:r>
@@ -20930,7 +20842,7 @@
           <w:szCs w:val="24"/>
         </w:rPr>
       </w:pPr>
-      <w:bookmarkStart w:id="81" w:name="_Toc236342540"/>
+      <w:bookmarkStart w:id="80" w:name="_Toc236342540"/>
       <w:r>
         <w:rPr>
           <w:color w:val="000000" w:themeColor="text1"/>
@@ -21038,7 +20950,7 @@
         </w:rPr>
         <w:t>: Fulfilment of the Specific Objectives</w:t>
       </w:r>
-      <w:bookmarkEnd w:id="81"/>
+      <w:bookmarkEnd w:id="80"/>
     </w:p>
     <w:tbl>
       <w:tblPr>
@@ -21490,7 +21402,7 @@
           <w:lang w:val="en-GB"/>
         </w:rPr>
       </w:pPr>
-      <w:bookmarkStart w:id="82" w:name="_Toc236342502"/>
+      <w:bookmarkStart w:id="81" w:name="_Toc236342502"/>
       <w:r>
         <w:rPr>
           <w:lang w:val="en-GB"/>
@@ -21498,7 +21410,7 @@
         <w:lastRenderedPageBreak/>
         <w:t>Comparison with Traditional Selenium Testing</w:t>
       </w:r>
-      <w:bookmarkEnd w:id="82"/>
+      <w:bookmarkEnd w:id="81"/>
     </w:p>
     <w:p>
       <w:r>
@@ -21517,7 +21429,7 @@
           <w:szCs w:val="24"/>
         </w:rPr>
       </w:pPr>
-      <w:bookmarkStart w:id="83" w:name="_Toc236342541"/>
+      <w:bookmarkStart w:id="82" w:name="_Toc236342541"/>
       <w:r>
         <w:rPr>
           <w:color w:val="000000" w:themeColor="text1"/>
@@ -21624,7 +21536,7 @@
         </w:rPr>
         <w:t>: Comparison with Traditional Selenium Testing</w:t>
       </w:r>
-      <w:bookmarkEnd w:id="83"/>
+      <w:bookmarkEnd w:id="82"/>
     </w:p>
     <w:tbl>
       <w:tblPr>
@@ -22286,14 +22198,14 @@
           <w:lang w:val="en-GB"/>
         </w:rPr>
       </w:pPr>
-      <w:bookmarkStart w:id="84" w:name="_Toc236342503"/>
+      <w:bookmarkStart w:id="83" w:name="_Toc236342503"/>
       <w:r>
         <w:rPr>
           <w:lang w:val="en-GB"/>
         </w:rPr>
         <w:t>Summary of Findings</w:t>
       </w:r>
-      <w:bookmarkEnd w:id="84"/>
+      <w:bookmarkEnd w:id="83"/>
     </w:p>
     <w:p>
       <w:r>
@@ -22435,28 +22347,28 @@
         <w:pStyle w:val="Heading1"/>
         <w:jc w:val="center"/>
       </w:pPr>
-      <w:bookmarkStart w:id="85" w:name="_Toc236342504"/>
+      <w:bookmarkStart w:id="84" w:name="_Toc236342504"/>
       <w:r>
         <w:lastRenderedPageBreak/>
         <w:t>CONCLUSION AND FUTURE ENHANCEMENT</w:t>
       </w:r>
+      <w:bookmarkEnd w:id="84"/>
+    </w:p>
+    <w:p>
+      <w:pPr>
+        <w:pStyle w:val="Heading2"/>
+        <w:rPr>
+          <w:lang w:val="en-GB"/>
+        </w:rPr>
+      </w:pPr>
+      <w:bookmarkStart w:id="85" w:name="_Toc236342505"/>
+      <w:r>
+        <w:rPr>
+          <w:lang w:val="en-GB"/>
+        </w:rPr>
+        <w:t>Conclusion</w:t>
+      </w:r>
       <w:bookmarkEnd w:id="85"/>
-    </w:p>
-    <w:p>
-      <w:pPr>
-        <w:pStyle w:val="Heading2"/>
-        <w:rPr>
-          <w:lang w:val="en-GB"/>
-        </w:rPr>
-      </w:pPr>
-      <w:bookmarkStart w:id="86" w:name="_Toc236342505"/>
-      <w:r>
-        <w:rPr>
-          <w:lang w:val="en-GB"/>
-        </w:rPr>
-        <w:t>Conclusion</w:t>
-      </w:r>
-      <w:bookmarkEnd w:id="86"/>
     </w:p>
     <w:p>
       <w:r>
@@ -22806,24 +22718,24 @@
           <w:lang w:val="en-GB"/>
         </w:rPr>
       </w:pPr>
-      <w:bookmarkStart w:id="87" w:name="_Toc236342506"/>
+      <w:bookmarkStart w:id="86" w:name="_Toc236342506"/>
       <w:r>
         <w:rPr>
           <w:lang w:val="en-GB"/>
         </w:rPr>
         <w:t>Future Enhancement</w:t>
       </w:r>
+      <w:bookmarkEnd w:id="86"/>
+    </w:p>
+    <w:p>
+      <w:pPr>
+        <w:pStyle w:val="Heading3"/>
+      </w:pPr>
+      <w:bookmarkStart w:id="87" w:name="_Toc236342507"/>
+      <w:r>
+        <w:t>Limitations and Challenges Encountered</w:t>
+      </w:r>
       <w:bookmarkEnd w:id="87"/>
-    </w:p>
-    <w:p>
-      <w:pPr>
-        <w:pStyle w:val="Heading3"/>
-      </w:pPr>
-      <w:bookmarkStart w:id="88" w:name="_Toc236342507"/>
-      <w:r>
-        <w:t>Limitations and Challenges Encountered</w:t>
-      </w:r>
-      <w:bookmarkEnd w:id="88"/>
     </w:p>
     <w:p>
       <w:r>
@@ -22935,11 +22847,11 @@
       <w:pPr>
         <w:pStyle w:val="Heading3"/>
       </w:pPr>
-      <w:bookmarkStart w:id="89" w:name="_Toc236342508"/>
+      <w:bookmarkStart w:id="88" w:name="_Toc236342508"/>
       <w:r>
         <w:t>Proposed Improvements</w:t>
       </w:r>
-      <w:bookmarkEnd w:id="89"/>
+      <w:bookmarkEnd w:id="88"/>
     </w:p>
     <w:p>
       <w:r>
@@ -23090,11 +23002,11 @@
       <w:pPr>
         <w:pStyle w:val="Heading3"/>
       </w:pPr>
-      <w:bookmarkStart w:id="90" w:name="_Toc236342509"/>
+      <w:bookmarkStart w:id="89" w:name="_Toc236342509"/>
       <w:r>
         <w:t>Additional Features and Modules</w:t>
       </w:r>
-      <w:bookmarkEnd w:id="90"/>
+      <w:bookmarkEnd w:id="89"/>
     </w:p>
     <w:p>
       <w:r>
@@ -23296,11 +23208,11 @@
       <w:pPr>
         <w:pStyle w:val="Heading3"/>
       </w:pPr>
-      <w:bookmarkStart w:id="91" w:name="_Toc236342510"/>
+      <w:bookmarkStart w:id="90" w:name="_Toc236342510"/>
       <w:r>
         <w:t>Scalability, Integration and Wider Application</w:t>
       </w:r>
-      <w:bookmarkEnd w:id="91"/>
+      <w:bookmarkEnd w:id="90"/>
     </w:p>
     <w:p>
       <w:r>
@@ -23506,7 +23418,7 @@
         <w:br w:type="page"/>
       </w:r>
     </w:p>
-    <w:bookmarkStart w:id="92" w:name="_Toc236342511" w:displacedByCustomXml="next"/>
+    <w:bookmarkStart w:id="91" w:name="_Toc236342511" w:displacedByCustomXml="next"/>
     <w:sdt>
       <w:sdtPr>
         <w:rPr>
@@ -23530,7 +23442,7 @@
           <w:r>
             <w:t>References</w:t>
           </w:r>
-          <w:bookmarkEnd w:id="92"/>
+          <w:bookmarkEnd w:id="91"/>
         </w:p>
         <w:sdt>
           <w:sdtPr>
@@ -27384,7 +27296,7 @@
       <w:lvlText w:val="%7."/>
       <w:lvlJc w:val="left"/>
       <w:pPr>
-        <w:ind w:left="720" w:hanging="360"/>
+        <w:ind w:left="360" w:hanging="360"/>
       </w:pPr>
       <w:rPr>
         <w:rFonts w:hint="default"/>

</xml_diff>